<commit_message>
Fix sustituir la generacion de dc3 a pdf con folio
</commit_message>
<xml_diff>
--- a/pkg/dc3/plantilla/dc3.docx
+++ b/pkg/dc3/plantilla/dc3.docx
@@ -10204,6 +10204,22 @@
           <w:sz w:val="18"/>
         </w:rPr>
         <w:t>VERSO</w:t>
+      </w:r>
+    </w:p>
+    <w:p>
+      <w:pPr>
+        <w:jc w:val="center"/>
+        <w:rPr>
+          <w:rFonts w:ascii="Arial Narrow" w:hAnsi="Arial Narrow"/>
+          <w:sz w:val="14"/>
+        </w:rPr>
+      </w:pPr>
+      <w:r>
+        <w:rPr>
+          <w:rFonts w:ascii="Arial Narrow" w:hAnsi="Arial Narrow"/>
+          <w:sz w:val="14"/>
+        </w:rPr>
+        <w:t xml:space="preserve">{Folio}</w:t>
       </w:r>
     </w:p>
     <w:sectPr>

</xml_diff>